<commit_message>
changed the report file
</commit_message>
<xml_diff>
--- a/Capstone_Report_Helal_Alaawaj.docx
+++ b/Capstone_Report_Helal_Alaawaj.docx
@@ -17,6 +17,16 @@
           <w:color w:val="1F4E79"/>
           <w:sz w:val="44"/>
           <w:szCs w:val="44"/>
+        </w:rPr>
+        <w:t xml:space="preserve"> </w:t>
+      </w:r>
+      <w:r>
+        <w:rPr>
+          <w:b/>
+          <w:bCs/>
+          <w:color w:val="1F4E79"/>
+          <w:sz w:val="44"/>
+          <w:szCs w:val="44"/>
           <w:lang w:val="en-GB"/>
         </w:rPr>
         <w:t>Mapping Technological Similarity Between Companies</w:t>
@@ -173,7 +183,13 @@
         <w:rPr>
           <w:lang w:val="en-GB"/>
         </w:rPr>
-        <w:t>40</w:t>
+        <w:t>5</w:t>
+      </w:r>
+      <w:r>
+        <w:rPr>
+          <w:lang w:val="en-GB"/>
+        </w:rPr>
+        <w:t>0</w:t>
       </w:r>
       <w:r>
         <w:rPr>
@@ -185,7 +201,7 @@
         <w:rPr>
           <w:lang w:val="en-GB"/>
         </w:rPr>
-        <w:t>6</w:t>
+        <w:t>5</w:t>
       </w:r>
       <w:r>
         <w:rPr>
@@ -224,12 +240,37 @@
         <w:t xml:space="preserve">Source code: </w:t>
       </w:r>
       <w:hyperlink r:id="rId7" w:history="1">
+        <w:proofErr w:type="spellStart"/>
         <w:r>
           <w:rPr>
             <w:rStyle w:val="Hyperlink"/>
             <w:lang w:val="en-GB"/>
           </w:rPr>
-          <w:t>github.com/SaadHelal-IMC/Capstone-Project</w:t>
+          <w:t>SaadHelal</w:t>
+        </w:r>
+        <w:proofErr w:type="spellEnd"/>
+        <w:r>
+          <w:rPr>
+            <w:rStyle w:val="Hyperlink"/>
+            <w:lang w:val="en-GB"/>
+          </w:rPr>
+          <w:t>-IMC/</w:t>
+        </w:r>
+        <w:proofErr w:type="spellStart"/>
+        <w:r>
+          <w:rPr>
+            <w:rStyle w:val="Hyperlink"/>
+            <w:lang w:val="en-GB"/>
+          </w:rPr>
+          <w:t>Epo</w:t>
+        </w:r>
+        <w:proofErr w:type="spellEnd"/>
+        <w:r>
+          <w:rPr>
+            <w:rStyle w:val="Hyperlink"/>
+            <w:lang w:val="en-GB"/>
+          </w:rPr>
+          <w:t>-companies-similarity-graph</w:t>
         </w:r>
       </w:hyperlink>
     </w:p>
@@ -275,7 +316,21 @@
         <w:rPr>
           <w:lang w:val="en-GB"/>
         </w:rPr>
-        <w:t>Understanding which companies operate in similar technological spaces is valuable for competitive intelligence, partner discovery, and innovation policy, yet such relationships are rarely stated explicitly. This project infers them from text. We collected 3,799 European patent applications filed in 2023-2024 by 34 large multinational companies across five technology areas (artificial intelligence, telecommunications, wireless networks, batteries, and electric mobility) using the European Patent Office Open Patent Services (EPO OPS) API. After cleaning applicant names and translating 321 non-English abstracts into English, 3,769 abstracts with usable text were carried into the analysis. Each patent abstract was turned into a numeric vector using two competing methods: a classical lexical baseline (TF-IDF) and a modern semantic encoder (Sentence-BERT, all-MiniLM-L6-v2). Patents were aggregated into a single vector per company, and pairwise cosine similarity produced a 34×34 company-similarity matrix for each method. We then clustered companies with K-Means and hierarchical (Ward) clustering, built a similarity network with NetworkX, and extracted latent technology themes with Latent Dirichlet Allocation. Sentence-BERT clearly outperformed the lexical baseline, raising the silhouette score from 0.063 to 0.131 and producing five interpretable groups: industrial/automotive, technology/telecom, electronics/materials, healthcare, and a pharmaceutical outlier (Novartis). The resulting network reproduced intuitive rivalries (Toyota and Honda, BMW and Volkswagen, Google and Microsoft) and identified IBM, Roche, and Philips as bridges between communities. The main finding is that semantic embeddings recover industry structure that keyword overlap misses, while translation removes language as a confounding signal.</w:t>
+        <w:t xml:space="preserve">Understanding which companies operate in similar technological spaces is valuable for competitive intelligence, partner discovery, and innovation policy, yet such relationships are rarely stated explicitly. This project infers them from text. We collected 3,799 European patent applications filed in 2023-2024 by 34 large multinational companies across five technology areas (artificial intelligence, telecommunications, wireless networks, batteries, and electric mobility) using the European Patent Office Open Patent Services (EPO OPS) API. After cleaning applicant names and translating 321 non-English abstracts into English, 3,769 abstracts with usable text were carried into the analysis. Each patent abstract was turned into a numeric vector using two competing methods: a classical lexical baseline (TF-IDF) and a modern semantic encoder (Sentence-BERT, all-MiniLM-L6-v2). Patents were aggregated into a single vector per company, and pairwise cosine similarity produced a 34×34 company-similarity matrix for each method. We then clustered companies with K-Means and hierarchical (Ward) clustering, built a similarity network with </w:t>
+      </w:r>
+      <w:proofErr w:type="spellStart"/>
+      <w:r>
+        <w:rPr>
+          <w:lang w:val="en-GB"/>
+        </w:rPr>
+        <w:t>NetworkX</w:t>
+      </w:r>
+      <w:proofErr w:type="spellEnd"/>
+      <w:r>
+        <w:rPr>
+          <w:lang w:val="en-GB"/>
+        </w:rPr>
+        <w:t>, and extracted latent technology themes with Latent Dirichlet Allocation. Sentence-BERT clearly outperformed the lexical baseline, raising the silhouette score from 0.063 to 0.131 and producing five interpretable groups: industrial/automotive, technology/telecom, electronics/materials, healthcare, and a pharmaceutical outlier (Novartis). The resulting network reproduced intuitive rivalries (Toyota and Honda, BMW and Volkswagen, Google and Microsoft) and identified IBM, Roche, and Philips as bridges between communities. The main finding is that semantic embeddings recover industry structure that keyword overlap misses, while translation removes language as a confounding signal.</w:t>
       </w:r>
     </w:p>
     <w:p>
@@ -335,7 +390,21 @@
         <w:rPr>
           <w:lang w:val="en-GB"/>
         </w:rPr>
-        <w:t>Companies that work on similar technologies are natural competitors, potential collaborators, and useful comparators for analysts and investors. However, there is no official registry that says these firms are technologically alike. Industry classifications such as NACE or stock-market sectors are coarse and often misleading: a single conglomerate may file patents in batteries, software, and medical imaging at once. Patents, by contrast, are a direct, public, and standardized record of what a company actually invents. The problem we address is therefore: given only the text of companies' recent patents, can we automatically measure how technologically similar two companies are, group them into coherent communities, and identify which firms bridge otherwise separate fields?</w:t>
+        <w:t xml:space="preserve">Companies that work on similar technologies are natural competitors, potential collaborators, and useful comparators for analysts and investors. However, there is no official registry that says these firms are technologically alike. Industry classifications such as NACE or stock-market sectors are coarse and often misleading: a single conglomerate may file patents in batteries, software, and medical imaging at once. Patents, by contrast, are a direct, public, and standardized record of what a company </w:t>
+      </w:r>
+      <w:proofErr w:type="gramStart"/>
+      <w:r>
+        <w:rPr>
+          <w:lang w:val="en-GB"/>
+        </w:rPr>
+        <w:t>actually invents</w:t>
+      </w:r>
+      <w:proofErr w:type="gramEnd"/>
+      <w:r>
+        <w:rPr>
+          <w:lang w:val="en-GB"/>
+        </w:rPr>
+        <w:t>. The problem we address is therefore: given only the text of companies' recent patents, can we automatically measure how technologically similar two companies are, group them into coherent communities, and identify which firms bridge otherwise separate fields?</w:t>
       </w:r>
     </w:p>
     <w:p>
@@ -574,7 +643,21 @@
         <w:rPr>
           <w:lang w:val="en-GB"/>
         </w:rPr>
-        <w:t>Measuring similarity from text is a long-studied problem. The classical approach represents documents as term-frequency-inverse-document-frequency (TF-IDF) vectors (Salton &amp; Buckley, 1988), which weight words by how distinctive they are, and compares them with cosine similarity. TF-IDF is fast and interpretable but treats words as independent symbols: it cannot tell that automobile and vehicle mean the same thing. Modern sentence embeddings address this. Sentence-BERT (Reimers &amp; Gurevych, 2019) fine-tunes transformer language models so that semantically similar sentences map to nearby vectors, and the compact all-MiniLM-L6-v2 model has become a standard, efficient encoder for semantic similarity tasks.</w:t>
+        <w:t xml:space="preserve">Measuring similarity from text is a long-studied problem. The classical approach represents documents as term-frequency-inverse-document-frequency (TF-IDF) vectors (Salton &amp; Buckley, 1988), which weight words by how distinctive they are, and compares them with cosine similarity. TF-IDF is fast and interpretable but treats words as independent symbols: it cannot tell that automobile and vehicle mean the same thing. Modern sentence embeddings address this. Sentence-BERT (Reimers &amp; </w:t>
+      </w:r>
+      <w:proofErr w:type="spellStart"/>
+      <w:r>
+        <w:rPr>
+          <w:lang w:val="en-GB"/>
+        </w:rPr>
+        <w:t>Gurevych</w:t>
+      </w:r>
+      <w:proofErr w:type="spellEnd"/>
+      <w:r>
+        <w:rPr>
+          <w:lang w:val="en-GB"/>
+        </w:rPr>
+        <w:t>, 2019) fine-tunes transformer language models so that semantically similar sentences map to nearby vectors, and the compact all-MiniLM-L6-v2 model has become a standard, efficient encoder for semantic similarity tasks.</w:t>
       </w:r>
     </w:p>
     <w:p>
@@ -589,7 +672,21 @@
         <w:rPr>
           <w:lang w:val="en-GB"/>
         </w:rPr>
-        <w:t>In the patent domain, patent landscaping and technology-mapping studies use IPC co-occurrence, citation networks, and increasingly text embeddings to position firms and fields. Company-similarity and competitor-identification networks built from patents or filings are an established analytic tool. Clustering quality is commonly judged with the silhouette coefficient (Rousseeuw, 1987), and latent themes in a corpus are often extracted with Latent Dirichlet Allocation (Blei, Ng &amp; Jordan, 2003). Our contribution is not a new algorithm but a controlled head-to-head comparison of a lexical and a semantic representation on the same balanced, translated patent corpus.</w:t>
+        <w:t>In the patent domain, patent landscaping and technology-mapping studies use IPC co-occurrence, citation networks, and increasingly text embeddings to position firms and fields. Company-similarity and competitor-identification networks built from patents or filings are an established analytic tool. Clustering quality is commonly judged with the silhouette coefficient (</w:t>
+      </w:r>
+      <w:proofErr w:type="spellStart"/>
+      <w:r>
+        <w:rPr>
+          <w:lang w:val="en-GB"/>
+        </w:rPr>
+        <w:t>Rousseeuw</w:t>
+      </w:r>
+      <w:proofErr w:type="spellEnd"/>
+      <w:r>
+        <w:rPr>
+          <w:lang w:val="en-GB"/>
+        </w:rPr>
+        <w:t>, 1987), and latent themes in a corpus are often extracted with Latent Dirichlet Allocation (Blei, Ng &amp; Jordan, 2003). Our contribution is not a new algorithm but a controlled head-to-head comparison of a lexical and a semantic representation on the same balanced, translated patent corpus.</w:t>
       </w:r>
     </w:p>
     <w:p>
@@ -700,7 +797,21 @@
         <w:rPr>
           <w:lang w:val="en-GB"/>
         </w:rPr>
-        <w:t>Data was collected with a Python client (01_data_collection.py) that authenticates against EPO OPS with OAuth, then issues CQL queries combining an applicant name, an IPC area, and the 2023-2024 publication window. The client handles pagination and rate limiting and writes one row per patent. A cleaning step (02_eda.py) maps raw applicant strings to 34 canonical company names using substring matching plus a small set of special rules (for example BAYERISCHE MOTOREN WERKE to BMW, TELEFONAKTIEBOLAGET to ERICSSON). A translation step (02b_translate.py) detects each abstract's language with langdetect and translates the 321 non-English abstracts to English with deep-translator, preserving the original text in a separate column.</w:t>
+        <w:t xml:space="preserve">Data was collected with a Python client (01_data_collection.py) that authenticates against EPO OPS with OAuth, then issues CQL queries combining an applicant name, an IPC area, and the 2023-2024 publication window. The client handles pagination and rate limiting and writes one row per patent. A cleaning step (02_eda.py) maps raw applicant strings to 34 canonical company names using substring matching plus a small set of special rules (for example BAYERISCHE MOTOREN WERKE to BMW, TELEFONAKTIEBOLAGET to ERICSSON). A translation step (02b_translate.py) detects each abstract's language with </w:t>
+      </w:r>
+      <w:proofErr w:type="spellStart"/>
+      <w:r>
+        <w:rPr>
+          <w:lang w:val="en-GB"/>
+        </w:rPr>
+        <w:t>langdetect</w:t>
+      </w:r>
+      <w:proofErr w:type="spellEnd"/>
+      <w:r>
+        <w:rPr>
+          <w:lang w:val="en-GB"/>
+        </w:rPr>
+        <w:t xml:space="preserve"> and translates the 321 non-English abstracts to English with deep-translator, preserving the original text in a separate column.</w:t>
       </w:r>
     </w:p>
     <w:p>
@@ -772,8 +883,20 @@
                 <w:sz w:val="21"/>
                 <w:szCs w:val="21"/>
               </w:rPr>
-              <w:t>Patents per IPC area</w:t>
-            </w:r>
+              <w:t xml:space="preserve">Patents per IPC </w:t>
+            </w:r>
+            <w:proofErr w:type="spellStart"/>
+            <w:r>
+              <w:rPr>
+                <w:b/>
+                <w:bCs/>
+                <w:color w:val="FFFFFF"/>
+                <w:sz w:val="21"/>
+                <w:szCs w:val="21"/>
+              </w:rPr>
+              <w:t>area</w:t>
+            </w:r>
+            <w:proofErr w:type="spellEnd"/>
           </w:p>
         </w:tc>
         <w:tc>
@@ -837,7 +960,43 @@
                 <w:sz w:val="21"/>
                 <w:szCs w:val="21"/>
               </w:rPr>
-              <w:t>G06N (AI / machine learning)</w:t>
+              <w:t xml:space="preserve">G06N (AI / </w:t>
+            </w:r>
+            <w:proofErr w:type="spellStart"/>
+            <w:r>
+              <w:rPr>
+                <w:color w:val="000000"/>
+                <w:sz w:val="21"/>
+                <w:szCs w:val="21"/>
+              </w:rPr>
+              <w:t>machine</w:t>
+            </w:r>
+            <w:proofErr w:type="spellEnd"/>
+            <w:r>
+              <w:rPr>
+                <w:color w:val="000000"/>
+                <w:sz w:val="21"/>
+                <w:szCs w:val="21"/>
+              </w:rPr>
+              <w:t xml:space="preserve"> </w:t>
+            </w:r>
+            <w:proofErr w:type="spellStart"/>
+            <w:r>
+              <w:rPr>
+                <w:color w:val="000000"/>
+                <w:sz w:val="21"/>
+                <w:szCs w:val="21"/>
+              </w:rPr>
+              <w:t>learning</w:t>
+            </w:r>
+            <w:proofErr w:type="spellEnd"/>
+            <w:r>
+              <w:rPr>
+                <w:color w:val="000000"/>
+                <w:sz w:val="21"/>
+                <w:szCs w:val="21"/>
+              </w:rPr>
+              <w:t>)</w:t>
             </w:r>
           </w:p>
         </w:tc>
@@ -900,7 +1059,25 @@
                 <w:sz w:val="21"/>
                 <w:szCs w:val="21"/>
               </w:rPr>
-              <w:t>H04L (digital telecommunications)</w:t>
+              <w:t xml:space="preserve">H04L (digital </w:t>
+            </w:r>
+            <w:proofErr w:type="spellStart"/>
+            <w:r>
+              <w:rPr>
+                <w:color w:val="000000"/>
+                <w:sz w:val="21"/>
+                <w:szCs w:val="21"/>
+              </w:rPr>
+              <w:t>telecommunications</w:t>
+            </w:r>
+            <w:proofErr w:type="spellEnd"/>
+            <w:r>
+              <w:rPr>
+                <w:color w:val="000000"/>
+                <w:sz w:val="21"/>
+                <w:szCs w:val="21"/>
+              </w:rPr>
+              <w:t>)</w:t>
             </w:r>
           </w:p>
         </w:tc>
@@ -963,7 +1140,61 @@
                 <w:sz w:val="21"/>
                 <w:szCs w:val="21"/>
               </w:rPr>
-              <w:t>H01M (batteries / fuel cells)</w:t>
+              <w:t>H01M (</w:t>
+            </w:r>
+            <w:proofErr w:type="spellStart"/>
+            <w:r>
+              <w:rPr>
+                <w:color w:val="000000"/>
+                <w:sz w:val="21"/>
+                <w:szCs w:val="21"/>
+              </w:rPr>
+              <w:t>batteries</w:t>
+            </w:r>
+            <w:proofErr w:type="spellEnd"/>
+            <w:r>
+              <w:rPr>
+                <w:color w:val="000000"/>
+                <w:sz w:val="21"/>
+                <w:szCs w:val="21"/>
+              </w:rPr>
+              <w:t xml:space="preserve"> / </w:t>
+            </w:r>
+            <w:proofErr w:type="spellStart"/>
+            <w:r>
+              <w:rPr>
+                <w:color w:val="000000"/>
+                <w:sz w:val="21"/>
+                <w:szCs w:val="21"/>
+              </w:rPr>
+              <w:t>fuel</w:t>
+            </w:r>
+            <w:proofErr w:type="spellEnd"/>
+            <w:r>
+              <w:rPr>
+                <w:color w:val="000000"/>
+                <w:sz w:val="21"/>
+                <w:szCs w:val="21"/>
+              </w:rPr>
+              <w:t xml:space="preserve"> </w:t>
+            </w:r>
+            <w:proofErr w:type="spellStart"/>
+            <w:r>
+              <w:rPr>
+                <w:color w:val="000000"/>
+                <w:sz w:val="21"/>
+                <w:szCs w:val="21"/>
+              </w:rPr>
+              <w:t>cells</w:t>
+            </w:r>
+            <w:proofErr w:type="spellEnd"/>
+            <w:r>
+              <w:rPr>
+                <w:color w:val="000000"/>
+                <w:sz w:val="21"/>
+                <w:szCs w:val="21"/>
+              </w:rPr>
+              <w:t>)</w:t>
             </w:r>
           </w:p>
         </w:tc>
@@ -1026,7 +1257,43 @@
                 <w:sz w:val="21"/>
                 <w:szCs w:val="21"/>
               </w:rPr>
-              <w:t>H04W (wireless networks)</w:t>
+              <w:t>H04W (</w:t>
+            </w:r>
+            <w:proofErr w:type="spellStart"/>
+            <w:r>
+              <w:rPr>
+                <w:color w:val="000000"/>
+                <w:sz w:val="21"/>
+                <w:szCs w:val="21"/>
+              </w:rPr>
+              <w:t>wireless</w:t>
+            </w:r>
+            <w:proofErr w:type="spellEnd"/>
+            <w:r>
+              <w:rPr>
+                <w:color w:val="000000"/>
+                <w:sz w:val="21"/>
+                <w:szCs w:val="21"/>
+              </w:rPr>
+              <w:t xml:space="preserve"> </w:t>
+            </w:r>
+            <w:proofErr w:type="spellStart"/>
+            <w:r>
+              <w:rPr>
+                <w:color w:val="000000"/>
+                <w:sz w:val="21"/>
+                <w:szCs w:val="21"/>
+              </w:rPr>
+              <w:t>networks</w:t>
+            </w:r>
+            <w:proofErr w:type="spellEnd"/>
+            <w:r>
+              <w:rPr>
+                <w:color w:val="000000"/>
+                <w:sz w:val="21"/>
+                <w:szCs w:val="21"/>
+              </w:rPr>
+              <w:t>)</w:t>
             </w:r>
           </w:p>
         </w:tc>
@@ -1089,7 +1356,43 @@
                 <w:sz w:val="21"/>
                 <w:szCs w:val="21"/>
               </w:rPr>
-              <w:t>B60L (electric-vehicle propulsion)</w:t>
+              <w:t>B60L (</w:t>
+            </w:r>
+            <w:proofErr w:type="spellStart"/>
+            <w:r>
+              <w:rPr>
+                <w:color w:val="000000"/>
+                <w:sz w:val="21"/>
+                <w:szCs w:val="21"/>
+              </w:rPr>
+              <w:t>electric-vehicle</w:t>
+            </w:r>
+            <w:proofErr w:type="spellEnd"/>
+            <w:r>
+              <w:rPr>
+                <w:color w:val="000000"/>
+                <w:sz w:val="21"/>
+                <w:szCs w:val="21"/>
+              </w:rPr>
+              <w:t xml:space="preserve"> </w:t>
+            </w:r>
+            <w:proofErr w:type="spellStart"/>
+            <w:r>
+              <w:rPr>
+                <w:color w:val="000000"/>
+                <w:sz w:val="21"/>
+                <w:szCs w:val="21"/>
+              </w:rPr>
+              <w:t>propulsion</w:t>
+            </w:r>
+            <w:proofErr w:type="spellEnd"/>
+            <w:r>
+              <w:rPr>
+                <w:color w:val="000000"/>
+                <w:sz w:val="21"/>
+                <w:szCs w:val="21"/>
+              </w:rPr>
+              <w:t>)</w:t>
             </w:r>
           </w:p>
         </w:tc>
@@ -1378,7 +1681,42 @@
         <w:rPr>
           <w:lang w:val="en-GB"/>
         </w:rPr>
-        <w:t>We formalize the task as follows. The corpus is a set of N = 3,769 patent abstracts, each a text document. An embedding function f maps every abstract to a vector x_i ∈ ℝ^d, with d = 5,000 for TF-IDF and d = 384 for Sentence-BERT. For a company c with its set of patents P</w:t>
+        <w:t xml:space="preserve">We formalize the task as follows. The corpus is a set of N = 3,769 patent abstracts, each a text document. An embedding function f maps every abstract to a vector </w:t>
+      </w:r>
+      <w:proofErr w:type="spellStart"/>
+      <w:r>
+        <w:rPr>
+          <w:lang w:val="en-GB"/>
+        </w:rPr>
+        <w:t>x_i</w:t>
+      </w:r>
+      <w:proofErr w:type="spellEnd"/>
+      <w:r>
+        <w:rPr>
+          <w:lang w:val="en-GB"/>
+        </w:rPr>
+        <w:t xml:space="preserve"> ∈ </w:t>
+      </w:r>
+      <w:proofErr w:type="spellStart"/>
+      <w:r>
+        <w:rPr>
+          <w:lang w:val="en-GB"/>
+        </w:rPr>
+        <w:t>ℝ^d</w:t>
+      </w:r>
+      <w:proofErr w:type="spellEnd"/>
+      <w:r>
+        <w:rPr>
+          <w:lang w:val="en-GB"/>
+        </w:rPr>
+        <w:t xml:space="preserve">, with d = 5,000 for TF-IDF and d = 384 for Sentence-BERT. For a company c with its set of patents </w:t>
+      </w:r>
+      <w:proofErr w:type="spellStart"/>
+      <w:r>
+        <w:rPr>
+          <w:lang w:val="en-GB"/>
+        </w:rPr>
+        <w:t>P</w:t>
       </w:r>
       <w:r>
         <w:rPr>
@@ -1390,7 +1728,14 @@
         <w:rPr>
           <w:lang w:val="en-GB"/>
         </w:rPr>
-        <w:t>c, we form a single company vector by averaging and L2-normalizing its patent vectors:</w:t>
+        <w:t>c</w:t>
+      </w:r>
+      <w:proofErr w:type="spellEnd"/>
+      <w:r>
+        <w:rPr>
+          <w:lang w:val="en-GB"/>
+        </w:rPr>
+        <w:t>, we form a single company vector by averaging and L2-normalizing its patent vectors:</w:t>
       </w:r>
     </w:p>
     <w:p>
@@ -1454,7 +1799,21 @@
         <w:rPr>
           <w:lang w:val="en-GB"/>
         </w:rPr>
-        <w:t>With 34 companies this yields a matrix V ∈ ℝ^(34×d). The central object of the analysis is the pairwise cosine-similarity matrix S ∈ ℝ^(34×34), defined as:</w:t>
+        <w:t>With 34 companies this yields a matrix V ∈ ℝ^(34×d). The central object of the analysis is the pairwise cosine-similarity matrix S ∈ ℝ</w:t>
+      </w:r>
+      <w:proofErr w:type="gramStart"/>
+      <w:r>
+        <w:rPr>
+          <w:lang w:val="en-GB"/>
+        </w:rPr>
+        <w:t>^(</w:t>
+      </w:r>
+      <w:proofErr w:type="gramEnd"/>
+      <w:r>
+        <w:rPr>
+          <w:lang w:val="en-GB"/>
+        </w:rPr>
+        <w:t>34×34), defined as:</w:t>
       </w:r>
     </w:p>
     <w:p>
@@ -1518,7 +1877,35 @@
         <w:rPr>
           <w:lang w:val="en-GB"/>
         </w:rPr>
-        <w:t xml:space="preserve">The outputs are: (i) a cluster label y_c ∈ {0, …, 4} for each company; (ii) an undirected similarity graph G = (V, E) where an edge connects two firms whose similarity exceeds a threshold </w:t>
+        <w:t>The outputs are: (</w:t>
+      </w:r>
+      <w:proofErr w:type="spellStart"/>
+      <w:r>
+        <w:rPr>
+          <w:lang w:val="en-GB"/>
+        </w:rPr>
+        <w:t>i</w:t>
+      </w:r>
+      <w:proofErr w:type="spellEnd"/>
+      <w:r>
+        <w:rPr>
+          <w:lang w:val="en-GB"/>
+        </w:rPr>
+        <w:t xml:space="preserve">) a cluster label </w:t>
+      </w:r>
+      <w:proofErr w:type="spellStart"/>
+      <w:r>
+        <w:rPr>
+          <w:lang w:val="en-GB"/>
+        </w:rPr>
+        <w:t>y_c</w:t>
+      </w:r>
+      <w:proofErr w:type="spellEnd"/>
+      <w:r>
+        <w:rPr>
+          <w:lang w:val="en-GB"/>
+        </w:rPr>
+        <w:t xml:space="preserve"> ∈ {0, …, 4} for each company; (ii) an undirected similarity graph G = (V, E) where an edge connects two firms whose similarity exceeds a threshold </w:t>
       </w:r>
       <w:r>
         <w:t>τ</w:t>
@@ -1554,10 +1941,84 @@
         <w:rPr>
           <w:lang w:val="en-GB"/>
         </w:rPr>
-        <w:t xml:space="preserve">Two embedding spaces are compared. The TF-IDF vectorizer uses up to 5,000 features, English stop-word removal, unigrams and bigrams, sublinear term-frequency scaling, and document-frequency cut-offs (min_df = 3, max_df = 0.85). Sentence-BERT uses the pre-trained all-MiniLM-L6-v2 model to encode each abstract into a 384-dimensional semantic vector. Both spaces feed the identical downstream pipeline so the comparison is fair: cosine similarity, K-Means (k = 5, matching the five technology areas, validated with elbow and silhouette analysis), hierarchical clustering with Ward linkage, t-SNE for 2-D visualization, a NetworkX similarity graph with degree and betweenness centrality, and an LDA topic model with 8 topics. </w:t>
-      </w:r>
-      <w:r>
-        <w:t>The full flow is shown in Figure 1.</w:t>
+        <w:t>Two embedding spaces are compared. The TF-IDF vectorizer uses up to 5,000 features, English stop-word removal, unigrams and bigrams, sublinear term-frequency scaling, and document-frequency cut-offs (</w:t>
+      </w:r>
+      <w:proofErr w:type="spellStart"/>
+      <w:r>
+        <w:rPr>
+          <w:lang w:val="en-GB"/>
+        </w:rPr>
+        <w:t>min_df</w:t>
+      </w:r>
+      <w:proofErr w:type="spellEnd"/>
+      <w:r>
+        <w:rPr>
+          <w:lang w:val="en-GB"/>
+        </w:rPr>
+        <w:t xml:space="preserve"> = 3, </w:t>
+      </w:r>
+      <w:proofErr w:type="spellStart"/>
+      <w:r>
+        <w:rPr>
+          <w:lang w:val="en-GB"/>
+        </w:rPr>
+        <w:t>max_df</w:t>
+      </w:r>
+      <w:proofErr w:type="spellEnd"/>
+      <w:r>
+        <w:rPr>
+          <w:lang w:val="en-GB"/>
+        </w:rPr>
+        <w:t xml:space="preserve"> = 0.85). Sentence-BERT uses the pre-trained all-MiniLM-L6-v2 model to encode each abstract into a 384-dimensional semantic vector. Both spaces feed the identical downstream pipeline so the comparison is fair: cosine similarity, K-Means (k = 5, matching the five technology areas, validated with elbow and silhouette analysis), hierarchical clustering with Ward linkage, t-SNE for 2-D visualization, a </w:t>
+      </w:r>
+      <w:proofErr w:type="spellStart"/>
+      <w:r>
+        <w:rPr>
+          <w:lang w:val="en-GB"/>
+        </w:rPr>
+        <w:t>NetworkX</w:t>
+      </w:r>
+      <w:proofErr w:type="spellEnd"/>
+      <w:r>
+        <w:rPr>
+          <w:lang w:val="en-GB"/>
+        </w:rPr>
+        <w:t xml:space="preserve"> similarity graph with degree and betweenness centrality, and an LDA topic model with 8 topics. </w:t>
+      </w:r>
+      <w:r>
+        <w:t xml:space="preserve">The </w:t>
+      </w:r>
+      <w:proofErr w:type="spellStart"/>
+      <w:r>
+        <w:t>full</w:t>
+      </w:r>
+      <w:proofErr w:type="spellEnd"/>
+      <w:r>
+        <w:t xml:space="preserve"> </w:t>
+      </w:r>
+      <w:proofErr w:type="spellStart"/>
+      <w:r>
+        <w:t>flow</w:t>
+      </w:r>
+      <w:proofErr w:type="spellEnd"/>
+      <w:r>
+        <w:t xml:space="preserve"> </w:t>
+      </w:r>
+      <w:proofErr w:type="spellStart"/>
+      <w:r>
+        <w:t>is</w:t>
+      </w:r>
+      <w:proofErr w:type="spellEnd"/>
+      <w:r>
+        <w:t xml:space="preserve"> </w:t>
+      </w:r>
+      <w:proofErr w:type="spellStart"/>
+      <w:r>
+        <w:t>shown</w:t>
+      </w:r>
+      <w:proofErr w:type="spellEnd"/>
+      <w:r>
+        <w:t xml:space="preserve"> in Figure 1.</w:t>
       </w:r>
     </w:p>
     <w:p>
@@ -1681,7 +2142,63 @@
         <w:rPr>
           <w:lang w:val="en-GB"/>
         </w:rPr>
-        <w:t>The project is implemented entirely in Python 3.10. Data handling uses pandas and numpy; collection uses requests and python-dotenv; translation uses langdetect and deep-translator; modelling uses scikit-learn (TF-IDF, K-Means, hierarchical clustering, t-SNE, LDA) and sentence-transformers (SBERT); the network is built with networkx; and all figures are produced with matplotlib and seaborn. The code base is organized as four numbered scripts that run in sequence and is published with a requirements.txt and a README on GitHub.</w:t>
+        <w:t xml:space="preserve">The project is implemented entirely in Python 3.10. Data handling uses pandas and </w:t>
+      </w:r>
+      <w:proofErr w:type="spellStart"/>
+      <w:r>
+        <w:rPr>
+          <w:lang w:val="en-GB"/>
+        </w:rPr>
+        <w:t>numpy</w:t>
+      </w:r>
+      <w:proofErr w:type="spellEnd"/>
+      <w:r>
+        <w:rPr>
+          <w:lang w:val="en-GB"/>
+        </w:rPr>
+        <w:t>; collection uses requests and python-</w:t>
+      </w:r>
+      <w:proofErr w:type="spellStart"/>
+      <w:r>
+        <w:rPr>
+          <w:lang w:val="en-GB"/>
+        </w:rPr>
+        <w:t>dotenv</w:t>
+      </w:r>
+      <w:proofErr w:type="spellEnd"/>
+      <w:r>
+        <w:rPr>
+          <w:lang w:val="en-GB"/>
+        </w:rPr>
+        <w:t xml:space="preserve">; translation uses </w:t>
+      </w:r>
+      <w:proofErr w:type="spellStart"/>
+      <w:r>
+        <w:rPr>
+          <w:lang w:val="en-GB"/>
+        </w:rPr>
+        <w:t>langdetect</w:t>
+      </w:r>
+      <w:proofErr w:type="spellEnd"/>
+      <w:r>
+        <w:rPr>
+          <w:lang w:val="en-GB"/>
+        </w:rPr>
+        <w:t xml:space="preserve"> and deep-translator; modelling uses scikit-learn (TF-IDF, K-Means, hierarchical clustering, t-SNE, LDA) and sentence-transformers (SBERT); the network is built with </w:t>
+      </w:r>
+      <w:proofErr w:type="spellStart"/>
+      <w:r>
+        <w:rPr>
+          <w:lang w:val="en-GB"/>
+        </w:rPr>
+        <w:t>networkx</w:t>
+      </w:r>
+      <w:proofErr w:type="spellEnd"/>
+      <w:r>
+        <w:rPr>
+          <w:lang w:val="en-GB"/>
+        </w:rPr>
+        <w:t>; and all figures are produced with matplotlib and seaborn. The code base is organized as four numbered scripts that run in sequence and is published with a requirements.txt and a README on GitHub.</w:t>
       </w:r>
     </w:p>
     <w:p>
@@ -1726,7 +2243,21 @@
         <w:rPr>
           <w:lang w:val="en-GB"/>
         </w:rPr>
-        <w:t>The central experiment is the head-to-head comparison of TF-IDF and Sentence-BERT under an identical downstream pipeline. We evaluate each representation along three axes: cluster separation (silhouette score at k = 5), the distribution of pairwise similarities (mean, minimum, maximum), and the qualitative interpretability of the resulting clusters, top pairs, and network. Because the task is unsupervised, there is no held-out accuracy; instead, the evaluation protocol combines the internal silhouette metric with the pre-registered success criteria from Section 2.1. Cluster count was checked with an elbow/silhouette sweep over k = 2..10, which supported a small number of clusters consistent with the five technology areas. The silhouette coefficient measures, for each point, how much closer it is to its own cluster than to the nearest other cluster; it ranges from -1 to 1, and higher is better.</w:t>
+        <w:t xml:space="preserve">The central experiment is the head-to-head comparison of TF-IDF and Sentence-BERT under an identical downstream pipeline. We evaluate each representation along three axes: cluster separation (silhouette score at k = 5), the distribution of pairwise similarities (mean, minimum, maximum), and the qualitative interpretability of the resulting clusters, top pairs, and network. Because the task is unsupervised, there is no held-out accuracy; instead, the evaluation protocol combines the internal silhouette metric with the pre-registered success criteria from Section 2.1. Cluster count was checked with an elbow/silhouette sweep over k = </w:t>
+      </w:r>
+      <w:proofErr w:type="gramStart"/>
+      <w:r>
+        <w:rPr>
+          <w:lang w:val="en-GB"/>
+        </w:rPr>
+        <w:t>2..</w:t>
+      </w:r>
+      <w:proofErr w:type="gramEnd"/>
+      <w:r>
+        <w:rPr>
+          <w:lang w:val="en-GB"/>
+        </w:rPr>
+        <w:t>10, which supported a small number of clusters consistent with the five technology areas. The silhouette coefficient measures, for each point, how much closer it is to its own cluster than to the nearest other cluster; it ranges from -1 to 1, and higher is better.</w:t>
       </w:r>
     </w:p>
     <w:tbl>
@@ -1776,6 +2307,7 @@
             <w:pPr>
               <w:jc w:val="both"/>
             </w:pPr>
+            <w:proofErr w:type="spellStart"/>
             <w:r>
               <w:rPr>
                 <w:b/>
@@ -1787,6 +2319,7 @@
               <w:lastRenderedPageBreak/>
               <w:t>Metric</w:t>
             </w:r>
+            <w:proofErr w:type="spellEnd"/>
           </w:p>
         </w:tc>
         <w:tc>
@@ -1843,6 +2376,7 @@
             <w:pPr>
               <w:jc w:val="both"/>
             </w:pPr>
+            <w:proofErr w:type="spellStart"/>
             <w:r>
               <w:rPr>
                 <w:b/>
@@ -1851,7 +2385,18 @@
                 <w:sz w:val="21"/>
                 <w:szCs w:val="21"/>
               </w:rPr>
-              <w:t>Sentence-BERT</w:t>
+              <w:t>Sentence</w:t>
+            </w:r>
+            <w:proofErr w:type="spellEnd"/>
+            <w:r>
+              <w:rPr>
+                <w:b/>
+                <w:bCs/>
+                <w:color w:val="FFFFFF"/>
+                <w:sz w:val="21"/>
+                <w:szCs w:val="21"/>
+              </w:rPr>
+              <w:t>-BERT</w:t>
             </w:r>
           </w:p>
         </w:tc>
@@ -1883,8 +2428,18 @@
                 <w:sz w:val="21"/>
                 <w:szCs w:val="21"/>
               </w:rPr>
-              <w:t>Embedding dimensions</w:t>
-            </w:r>
+              <w:t xml:space="preserve">Embedding </w:t>
+            </w:r>
+            <w:proofErr w:type="spellStart"/>
+            <w:r>
+              <w:rPr>
+                <w:color w:val="000000"/>
+                <w:sz w:val="21"/>
+                <w:szCs w:val="21"/>
+              </w:rPr>
+              <w:t>dimensions</w:t>
+            </w:r>
+            <w:proofErr w:type="spellEnd"/>
           </w:p>
         </w:tc>
         <w:tc>
@@ -2070,8 +2625,36 @@
                 <w:sz w:val="21"/>
                 <w:szCs w:val="21"/>
               </w:rPr>
-              <w:t>Mean pairwise similarity</w:t>
-            </w:r>
+              <w:t xml:space="preserve">Mean </w:t>
+            </w:r>
+            <w:proofErr w:type="spellStart"/>
+            <w:r>
+              <w:rPr>
+                <w:color w:val="000000"/>
+                <w:sz w:val="21"/>
+                <w:szCs w:val="21"/>
+              </w:rPr>
+              <w:t>pairwise</w:t>
+            </w:r>
+            <w:proofErr w:type="spellEnd"/>
+            <w:r>
+              <w:rPr>
+                <w:color w:val="000000"/>
+                <w:sz w:val="21"/>
+                <w:szCs w:val="21"/>
+              </w:rPr>
+              <w:t xml:space="preserve"> </w:t>
+            </w:r>
+            <w:proofErr w:type="spellStart"/>
+            <w:r>
+              <w:rPr>
+                <w:color w:val="000000"/>
+                <w:sz w:val="21"/>
+                <w:szCs w:val="21"/>
+              </w:rPr>
+              <w:t>similarity</w:t>
+            </w:r>
+            <w:proofErr w:type="spellEnd"/>
           </w:p>
         </w:tc>
         <w:tc>
@@ -2163,8 +2746,36 @@
                 <w:sz w:val="21"/>
                 <w:szCs w:val="21"/>
               </w:rPr>
-              <w:t>Companies / patents analysed</w:t>
-            </w:r>
+              <w:t xml:space="preserve">Companies / </w:t>
+            </w:r>
+            <w:proofErr w:type="spellStart"/>
+            <w:r>
+              <w:rPr>
+                <w:color w:val="000000"/>
+                <w:sz w:val="21"/>
+                <w:szCs w:val="21"/>
+              </w:rPr>
+              <w:t>patents</w:t>
+            </w:r>
+            <w:proofErr w:type="spellEnd"/>
+            <w:r>
+              <w:rPr>
+                <w:color w:val="000000"/>
+                <w:sz w:val="21"/>
+                <w:szCs w:val="21"/>
+              </w:rPr>
+              <w:t xml:space="preserve"> </w:t>
+            </w:r>
+            <w:proofErr w:type="spellStart"/>
+            <w:r>
+              <w:rPr>
+                <w:color w:val="000000"/>
+                <w:sz w:val="21"/>
+                <w:szCs w:val="21"/>
+              </w:rPr>
+              <w:t>analysed</w:t>
+            </w:r>
+            <w:proofErr w:type="spellEnd"/>
           </w:p>
         </w:tc>
         <w:tc>
@@ -2952,14 +3563,34 @@
             <w:pPr>
               <w:jc w:val="both"/>
             </w:pPr>
-            <w:r>
-              <w:rPr>
-                <w:color w:val="000000"/>
-                <w:sz w:val="21"/>
-                <w:szCs w:val="21"/>
-              </w:rPr>
-              <w:t>Pharma outlier</w:t>
-            </w:r>
+            <w:proofErr w:type="spellStart"/>
+            <w:r>
+              <w:rPr>
+                <w:color w:val="000000"/>
+                <w:sz w:val="21"/>
+                <w:szCs w:val="21"/>
+              </w:rPr>
+              <w:t>Pharma</w:t>
+            </w:r>
+            <w:proofErr w:type="spellEnd"/>
+            <w:r>
+              <w:rPr>
+                <w:color w:val="000000"/>
+                <w:sz w:val="21"/>
+                <w:szCs w:val="21"/>
+              </w:rPr>
+              <w:t xml:space="preserve"> </w:t>
+            </w:r>
+            <w:proofErr w:type="spellStart"/>
+            <w:r>
+              <w:rPr>
+                <w:color w:val="000000"/>
+                <w:sz w:val="21"/>
+                <w:szCs w:val="21"/>
+              </w:rPr>
+              <w:t>outlier</w:t>
+            </w:r>
+            <w:proofErr w:type="spellEnd"/>
           </w:p>
         </w:tc>
         <w:tc>
@@ -3143,6 +3774,7 @@
             <w:pPr>
               <w:jc w:val="both"/>
             </w:pPr>
+            <w:proofErr w:type="spellStart"/>
             <w:r>
               <w:rPr>
                 <w:color w:val="000000"/>
@@ -3151,6 +3783,7 @@
               </w:rPr>
               <w:t>Healthcare</w:t>
             </w:r>
+            <w:proofErr w:type="spellEnd"/>
           </w:p>
         </w:tc>
         <w:tc>
@@ -3435,8 +4068,42 @@
                 <w:sz w:val="21"/>
                 <w:szCs w:val="21"/>
               </w:rPr>
-              <w:t>Most similar pairs</w:t>
-            </w:r>
+              <w:t xml:space="preserve">Most </w:t>
+            </w:r>
+            <w:proofErr w:type="spellStart"/>
+            <w:r>
+              <w:rPr>
+                <w:b/>
+                <w:bCs/>
+                <w:color w:val="FFFFFF"/>
+                <w:sz w:val="21"/>
+                <w:szCs w:val="21"/>
+              </w:rPr>
+              <w:t>similar</w:t>
+            </w:r>
+            <w:proofErr w:type="spellEnd"/>
+            <w:r>
+              <w:rPr>
+                <w:b/>
+                <w:bCs/>
+                <w:color w:val="FFFFFF"/>
+                <w:sz w:val="21"/>
+                <w:szCs w:val="21"/>
+              </w:rPr>
+              <w:t xml:space="preserve"> </w:t>
+            </w:r>
+            <w:proofErr w:type="spellStart"/>
+            <w:r>
+              <w:rPr>
+                <w:b/>
+                <w:bCs/>
+                <w:color w:val="FFFFFF"/>
+                <w:sz w:val="21"/>
+                <w:szCs w:val="21"/>
+              </w:rPr>
+              <w:t>pairs</w:t>
+            </w:r>
+            <w:proofErr w:type="spellEnd"/>
           </w:p>
         </w:tc>
         <w:tc>
@@ -3460,6 +4127,7 @@
             <w:pPr>
               <w:jc w:val="both"/>
             </w:pPr>
+            <w:proofErr w:type="spellStart"/>
             <w:r>
               <w:rPr>
                 <w:b/>
@@ -3470,6 +4138,7 @@
               </w:rPr>
               <w:t>Similarity</w:t>
             </w:r>
+            <w:proofErr w:type="spellEnd"/>
           </w:p>
         </w:tc>
         <w:tc>
@@ -3501,8 +4170,42 @@
                 <w:sz w:val="21"/>
                 <w:szCs w:val="21"/>
               </w:rPr>
-              <w:t>Least similar pairs</w:t>
-            </w:r>
+              <w:t xml:space="preserve">Least </w:t>
+            </w:r>
+            <w:proofErr w:type="spellStart"/>
+            <w:r>
+              <w:rPr>
+                <w:b/>
+                <w:bCs/>
+                <w:color w:val="FFFFFF"/>
+                <w:sz w:val="21"/>
+                <w:szCs w:val="21"/>
+              </w:rPr>
+              <w:t>similar</w:t>
+            </w:r>
+            <w:proofErr w:type="spellEnd"/>
+            <w:r>
+              <w:rPr>
+                <w:b/>
+                <w:bCs/>
+                <w:color w:val="FFFFFF"/>
+                <w:sz w:val="21"/>
+                <w:szCs w:val="21"/>
+              </w:rPr>
+              <w:t xml:space="preserve"> </w:t>
+            </w:r>
+            <w:proofErr w:type="spellStart"/>
+            <w:r>
+              <w:rPr>
+                <w:b/>
+                <w:bCs/>
+                <w:color w:val="FFFFFF"/>
+                <w:sz w:val="21"/>
+                <w:szCs w:val="21"/>
+              </w:rPr>
+              <w:t>pairs</w:t>
+            </w:r>
+            <w:proofErr w:type="spellEnd"/>
           </w:p>
         </w:tc>
         <w:tc>
@@ -3526,6 +4229,7 @@
             <w:pPr>
               <w:jc w:val="both"/>
             </w:pPr>
+            <w:proofErr w:type="spellStart"/>
             <w:r>
               <w:rPr>
                 <w:b/>
@@ -3536,6 +4240,7 @@
               </w:rPr>
               <w:t>Similarity</w:t>
             </w:r>
+            <w:proofErr w:type="spellEnd"/>
           </w:p>
         </w:tc>
       </w:tr>
@@ -4453,7 +5158,21 @@
         <w:rPr>
           <w:lang w:val="en-GB"/>
         </w:rPr>
-        <w:t>The results support all three success criteria. Quantitatively, Sentence-BERT beat the TF-IDF baseline on cluster separation by roughly a factor of two (silhouette 0.131 vs 0.063), and it did so with one-thirteenth of the dimensions. Qualitatively, its clusters map cleanly onto industries and its top pairs reproduce textbook rivalries (Toyota-Honda, BMW-Volkswagen, Google-Microsoft). The interpretation is that keyword overlap, which is all TF-IDF can see, is a weak proxy for technological similarity: two car makers may describe the same invention with different vocabulary, and TF-IDF penalises that, whereas SBERT recognises the shared meaning. This is the core finding of the project.</w:t>
+        <w:t xml:space="preserve">The results support all three success criteria. Quantitatively, Sentence-BERT beat the TF-IDF baseline on cluster separation by roughly a factor of two (silhouette 0.131 vs 0.063), and it did so with one-thirteenth of the dimensions. Qualitatively, its clusters map cleanly onto </w:t>
+      </w:r>
+      <w:proofErr w:type="gramStart"/>
+      <w:r>
+        <w:rPr>
+          <w:lang w:val="en-GB"/>
+        </w:rPr>
+        <w:t>industries</w:t>
+      </w:r>
+      <w:proofErr w:type="gramEnd"/>
+      <w:r>
+        <w:rPr>
+          <w:lang w:val="en-GB"/>
+        </w:rPr>
+        <w:t xml:space="preserve"> and its top pairs reproduce textbook rivalries (Toyota-Honda, BMW-Volkswagen, Google-Microsoft). The interpretation is that keyword overlap, which is all TF-IDF can see, is a weak proxy for technological similarity: two car makers may describe the same invention with different vocabulary, and TF-IDF penalises that, whereas SBERT recognises the shared meaning. This is the core finding of the project.</w:t>
       </w:r>
     </w:p>
     <w:p>
@@ -4490,7 +5209,49 @@
         <w:rPr>
           <w:lang w:val="en-GB"/>
         </w:rPr>
-        <w:t>Limitations. First, Novartis is represented by only two patents, so its outlier status is partly a sampling artefact rather than a deep statement about pharmaceutical innovation; any company with a thin sample would behave similarly. Second, averaging all of a company's patent vectors into one point discards internal diversity, since a conglomerate that genuinely works across several fields is collapsed to its centroid. Third, the corpus is restricted to five IPC areas and two years, so the similarity we measure is conditional on that slice of activity, not a company's entire portfolio. Fourth, the graph edge threshold is a free parameter; different thresholds change the network's density and which firms look like bridges, so the centrality numbers should be read as indicative rather than absolute.</w:t>
+        <w:t xml:space="preserve">Limitations. First, Novartis is represented by only two patents, so its outlier status is partly a sampling artefact rather than a deep statement about pharmaceutical innovation; any company with a thin sample would behave similarly. Second, averaging </w:t>
+      </w:r>
+      <w:proofErr w:type="gramStart"/>
+      <w:r>
+        <w:rPr>
+          <w:lang w:val="en-GB"/>
+        </w:rPr>
+        <w:t>all of</w:t>
+      </w:r>
+      <w:proofErr w:type="gramEnd"/>
+      <w:r>
+        <w:rPr>
+          <w:lang w:val="en-GB"/>
+        </w:rPr>
+        <w:t xml:space="preserve"> a company's patent vectors into </w:t>
+      </w:r>
+      <w:proofErr w:type="gramStart"/>
+      <w:r>
+        <w:rPr>
+          <w:lang w:val="en-GB"/>
+        </w:rPr>
+        <w:t>one point</w:t>
+      </w:r>
+      <w:proofErr w:type="gramEnd"/>
+      <w:r>
+        <w:rPr>
+          <w:lang w:val="en-GB"/>
+        </w:rPr>
+        <w:t xml:space="preserve"> discards internal diversity, since a conglomerate that genuinely works across several fields is collapsed to its centroid. Third, the corpus is restricted to five IPC areas and two years, so the similarity we measure is conditional on that slice of activity, not a company's entire portfolio. Fourth, the graph edge threshold is a free parameter; different thresholds change the network's </w:t>
+      </w:r>
+      <w:proofErr w:type="gramStart"/>
+      <w:r>
+        <w:rPr>
+          <w:lang w:val="en-GB"/>
+        </w:rPr>
+        <w:t>density</w:t>
+      </w:r>
+      <w:proofErr w:type="gramEnd"/>
+      <w:r>
+        <w:rPr>
+          <w:lang w:val="en-GB"/>
+        </w:rPr>
+        <w:t xml:space="preserve"> and which firms look like bridges, so the centrality numbers should be read as indicative rather than absolute.</w:t>
       </w:r>
     </w:p>
     <w:p>
@@ -4514,7 +5275,19 @@
         <w:jc w:val="both"/>
       </w:pPr>
       <w:r>
-        <w:t>5.1 Future work</w:t>
+        <w:t xml:space="preserve">5.1 </w:t>
+      </w:r>
+      <w:r>
+        <w:t xml:space="preserve">Possible </w:t>
+      </w:r>
+      <w:r>
+        <w:t xml:space="preserve">Future </w:t>
+      </w:r>
+      <w:r>
+        <w:t>W</w:t>
+      </w:r>
+      <w:r>
+        <w:t>ork</w:t>
       </w:r>
     </w:p>
     <w:p>
@@ -4554,7 +5327,21 @@
         <w:rPr>
           <w:lang w:val="en-GB"/>
         </w:rPr>
-        <w:t>Try domain-adapted or patent-specific embedding models (e.g., PatentSBERTa) that may capture technical language better than a general-purpose encoder.</w:t>
+        <w:t xml:space="preserve">Try domain-adapted or patent-specific embedding models (e.g., </w:t>
+      </w:r>
+      <w:proofErr w:type="spellStart"/>
+      <w:r>
+        <w:rPr>
+          <w:lang w:val="en-GB"/>
+        </w:rPr>
+        <w:t>PatentSBERTa</w:t>
+      </w:r>
+      <w:proofErr w:type="spellEnd"/>
+      <w:r>
+        <w:rPr>
+          <w:lang w:val="en-GB"/>
+        </w:rPr>
+        <w:t>) that may capture technical language better than a general-purpose encoder.</w:t>
       </w:r>
     </w:p>
     <w:p>
@@ -4574,7 +5361,21 @@
         <w:rPr>
           <w:lang w:val="en-GB"/>
         </w:rPr>
-        <w:t>Add patent citations to build a hybrid text-plus-citation similarity, and model each company as a sub-network rather than a single vector.</w:t>
+        <w:t xml:space="preserve">Add patent citations to build a hybrid text-plus-citation </w:t>
+      </w:r>
+      <w:proofErr w:type="gramStart"/>
+      <w:r>
+        <w:rPr>
+          <w:lang w:val="en-GB"/>
+        </w:rPr>
+        <w:t>similarity, and</w:t>
+      </w:r>
+      <w:proofErr w:type="gramEnd"/>
+      <w:r>
+        <w:rPr>
+          <w:lang w:val="en-GB"/>
+        </w:rPr>
+        <w:t xml:space="preserve"> model each company as a sub-network rather than a single vector.</w:t>
       </w:r>
     </w:p>
     <w:p>
@@ -4867,7 +5668,25 @@
           <w:szCs w:val="22"/>
           <w:lang w:val="en-GB"/>
         </w:rPr>
-        <w:t>Reimers, N., &amp; Gurevych, I. (2019). Sentence-BERT: Sentence Embeddings using Siamese BERT-Networks. Proceedings of EMNLP-IJCNLP 2019.</w:t>
+        <w:t xml:space="preserve">Reimers, N., &amp; </w:t>
+      </w:r>
+      <w:proofErr w:type="spellStart"/>
+      <w:r>
+        <w:rPr>
+          <w:sz w:val="22"/>
+          <w:szCs w:val="22"/>
+          <w:lang w:val="en-GB"/>
+        </w:rPr>
+        <w:t>Gurevych</w:t>
+      </w:r>
+      <w:proofErr w:type="spellEnd"/>
+      <w:r>
+        <w:rPr>
+          <w:sz w:val="22"/>
+          <w:szCs w:val="22"/>
+          <w:lang w:val="en-GB"/>
+        </w:rPr>
+        <w:t>, I. (2019). Sentence-BERT: Sentence Embeddings using Siamese BERT-Networks. Proceedings of EMNLP-IJCNLP 2019.</w:t>
       </w:r>
     </w:p>
     <w:p>
@@ -4878,13 +5697,23 @@
           <w:lang w:val="en-GB"/>
         </w:rPr>
       </w:pPr>
+      <w:proofErr w:type="spellStart"/>
       <w:r>
         <w:rPr>
           <w:sz w:val="22"/>
           <w:szCs w:val="22"/>
           <w:lang w:val="en-GB"/>
         </w:rPr>
-        <w:t>Rousseeuw, P. J. (1987). Silhouettes: A graphical aid to the interpretation and validation of cluster analysis. Journal of Computational and Applied Mathematics, 20, 53-65.</w:t>
+        <w:t>Rousseeuw</w:t>
+      </w:r>
+      <w:proofErr w:type="spellEnd"/>
+      <w:r>
+        <w:rPr>
+          <w:sz w:val="22"/>
+          <w:szCs w:val="22"/>
+          <w:lang w:val="en-GB"/>
+        </w:rPr>
+        <w:t>, P. J. (1987). Silhouettes: A graphical aid to the interpretation and validation of cluster analysis. Journal of Computational and Applied Mathematics, 20, 53-65.</w:t>
       </w:r>
     </w:p>
     <w:p>
@@ -4935,7 +5764,25 @@
           <w:szCs w:val="22"/>
           <w:lang w:val="en-GB"/>
         </w:rPr>
-        <w:t>Hagberg, A., Schult, D., &amp; Swart, P. (2008). Exploring network structure, dynamics, and function using NetworkX. Proceedings of the 7th Python in Science Conference (SciPy).</w:t>
+        <w:t xml:space="preserve">Hagberg, A., Schult, D., &amp; Swart, P. (2008). Exploring network structure, dynamics, and function using </w:t>
+      </w:r>
+      <w:proofErr w:type="spellStart"/>
+      <w:r>
+        <w:rPr>
+          <w:sz w:val="22"/>
+          <w:szCs w:val="22"/>
+          <w:lang w:val="en-GB"/>
+        </w:rPr>
+        <w:t>NetworkX</w:t>
+      </w:r>
+      <w:proofErr w:type="spellEnd"/>
+      <w:r>
+        <w:rPr>
+          <w:sz w:val="22"/>
+          <w:szCs w:val="22"/>
+          <w:lang w:val="en-GB"/>
+        </w:rPr>
+        <w:t>. Proceedings of the 7th Python in Science Conference (SciPy).</w:t>
       </w:r>
     </w:p>
     <w:p>
@@ -5003,7 +5850,43 @@
         <w:sz w:val="18"/>
         <w:szCs w:val="18"/>
       </w:rPr>
-      <w:t xml:space="preserve">Patent Company Graph  |  Capstone Report  |  </w:t>
+      <w:t xml:space="preserve">Patent Company </w:t>
+    </w:r>
+    <w:proofErr w:type="gramStart"/>
+    <w:r>
+      <w:rPr>
+        <w:color w:val="888888"/>
+        <w:sz w:val="18"/>
+        <w:szCs w:val="18"/>
+      </w:rPr>
+      <w:t>Graph  |</w:t>
+    </w:r>
+    <w:proofErr w:type="gramEnd"/>
+    <w:r>
+      <w:rPr>
+        <w:color w:val="888888"/>
+        <w:sz w:val="18"/>
+        <w:szCs w:val="18"/>
+      </w:rPr>
+      <w:t xml:space="preserve">  Capstone </w:t>
+    </w:r>
+    <w:proofErr w:type="gramStart"/>
+    <w:r>
+      <w:rPr>
+        <w:color w:val="888888"/>
+        <w:sz w:val="18"/>
+        <w:szCs w:val="18"/>
+      </w:rPr>
+      <w:t>Report  |</w:t>
+    </w:r>
+    <w:proofErr w:type="gramEnd"/>
+    <w:r>
+      <w:rPr>
+        <w:color w:val="888888"/>
+        <w:sz w:val="18"/>
+        <w:szCs w:val="18"/>
+      </w:rPr>
+      <w:t xml:space="preserve">  </w:t>
     </w:r>
     <w:r>
       <w:rPr>
@@ -5721,7 +6604,6 @@
   <w:style w:type="character" w:default="1" w:styleId="Absatz-Standardschriftart">
     <w:name w:val="Default Paragraph Font"/>
     <w:uiPriority w:val="1"/>
-    <w:semiHidden/>
     <w:unhideWhenUsed/>
   </w:style>
   <w:style w:type="table" w:default="1" w:styleId="NormaleTabelle">
@@ -5841,6 +6723,18 @@
     <w:rPr>
       <w:sz w:val="20"/>
       <w:szCs w:val="20"/>
+    </w:rPr>
+  </w:style>
+  <w:style w:type="character" w:styleId="NichtaufgelsteErwhnung">
+    <w:name w:val="Unresolved Mention"/>
+    <w:basedOn w:val="Absatz-Standardschriftart"/>
+    <w:uiPriority w:val="99"/>
+    <w:semiHidden/>
+    <w:unhideWhenUsed/>
+    <w:rsid w:val="00864EF9"/>
+    <w:rPr>
+      <w:color w:val="605E5C"/>
+      <w:shd w:val="clear" w:color="auto" w:fill="E1DFDD"/>
     </w:rPr>
   </w:style>
 </w:styles>

</xml_diff>